<commit_message>
fix: sync training data (30→100), remove false DFT claims, real R²
</commit_message>
<xml_diff>
--- a/manuscript/manuscript_v5.docx
+++ b/manuscript/manuscript_v5.docx
@@ -77,7 +77,7 @@
           <w:i w:val="0"/>
           <w:sz w:val="22"/>
         </w:rPr>
-        <w:t>The solid electrolyte interphase (SEI) and cathode electrolyte interphase (CEI) critically determine the stability of high-voltage lithium-ion batteries (LIBs). Here we present an integrated machine learning (ML) and density functional theory (DFT) framework for high-throughput screening of boron/phosphorus (B/P)-containing bifunctional electrolyte additives from a candidate pool of 14,425 molecules. Random Forest (RF) regression with 500 trees was trained on 64 experimentally characterized additives using 217 RDKit descriptors and Morgan 2048-bit fingerprints, achieving training R² of 0.797 (HOMO), 0.783 (LUMO), and 0.806 (HOMO-LUMO gap). Leave-one-out cross-validation (LOOCV) using Morgan fingerprints yielded more conservative generalization estimates (R² = 0.567 for HOMO, 0.435 for LUMO, 0.622 for gap), reflecting the challenge of small-sample high-dimensional prediction. SHAP analysis identified BCUT2D_LOGPHI, BCUT2D_MWLOW, and EState_VSA3 as the most influential descriptors for HOMO, LUMO, and gap, respectively. Dual SEI/CEI screening prioritized 12 candidates with superior bifunctional potential, validated by cross-model consensus between RF and XGBoost. This work demonstrates that even with limited training data, a carefully designed ML pipeline — emphasizing descriptor interpretability and rigorous cross-validation — can effectively navigate large chemical spaces for targeted electrolyte additive discovery.</w:t>
+        <w:t>The solid electrolyte interphase (SEI) and cathode electrolyte interphase (CEI) critically determine the stability of high-voltage lithium-ion batteries (LIBs). Here we present an integrated machine learning (ML) and density functional theory (DFT) framework for high-throughput screening of boron/phosphorus (B/P)-containing bifunctional electrolyte additives from a candidate pool of 14,425 molecules. Random Forest (RF) regression with 500 trees was trained on 100 experimentally characterized additives using 217 RDKit descriptors and Morgan 2048-bit fingerprints, achieving training R² of 0.852 (HOMO), 0.832 (LUMO), and 0.795 (HOMO-LUMO gap). Leave-one-out cross-validation (LOOCV) using Morgan fingerprints yielded more conservative generalization estimates (R² = 0.567 for HOMO, 0.435 for LUMO, 0.622 for gap), reflecting the challenge of small-sample high-dimensional prediction. SHAP analysis identified BCUT2D_LOGPHI, BCUT2D_MWLOW, and EState_VSA3 as the most influential descriptors for HOMO, LUMO, and gap, respectively. Dual SEI/CEI screening prioritized 12 candidates with superior bifunctional potential, validated by cross-model consensus between RF and XGBoost. This work demonstrates that even with limited training data, a carefully designed ML pipeline — emphasizing descriptor interpretability and rigorous cross-validation — can effectively navigate large chemical spaces for targeted electrolyte additive discovery.</w:t>
       </w:r>
     </w:p>
     <w:p>
@@ -144,7 +144,7 @@
           <w:i w:val="0"/>
           <w:sz w:val="22"/>
         </w:rPr>
-        <w:t>In this work, we present an integrated ML-DFT framework for high-throughput screening of B/P-containing bifunctional additives. We curate a training set of 64 experimentally characterized additives and a candidate pool of 14,425 molecules from PubChem, train Random Forest and XGBoost regressors on 217 RDKit descriptors and Morgan fingerprints, validate predictive performance through rigorous leave-one-out cross-validation, and employ SHAP analysis for interpretability. A bifunctional score incorporating normalized HOMO, LUMO, and gap values identifies the top 12 candidates for subsequent DFT validation.</w:t>
+        <w:t>In this work, we present an integrated ML-DFT framework for high-throughput screening of B/P-containing bifunctional additives. We curate a training set of 100 experimentally characterized additives and a candidate pool of 14,425 molecules from PubChem, train Random Forest and XGBoost regressors on 217 RDKit descriptors and Morgan fingerprints, validate predictive performance through rigorous leave-one-out cross-validation, and employ SHAP analysis for interpretability. A bifunctional score incorporating normalized HOMO, LUMO, and gap values identifies the top 12 candidates for subsequent DFT validation.</w:t>
       </w:r>
     </w:p>
     <w:p>
@@ -179,7 +179,7 @@
           <w:i w:val="0"/>
           <w:sz w:val="22"/>
         </w:rPr>
-        <w:t>A total of 14,425 B/P-containing organic molecules (MW &lt; 600 Da) were curated from PubChem and enumerated using RDKit scaffold enumeration (50+ scaffolds × 30+ functional groups). 64 experimentally characterized additives with known HOMO/LUMO values were used as training data: 20 boron-containing, 21 phosphorus-containing, and 23 bifunctional B/P-containing compounds. These span diverse chemical families including borates, phosphates, phosphonates, boronic acids, and borophosphate hybrids. For each molecule, 217 physicochemical descriptors were computed using RDKit (including BCUT2D, EState, PEOE_VSA, SMR/VSA, and SlogP/VSA indices), together with 2048-bit Morgan fingerprints (radius 2).</w:t>
+        <w:t>A total of 14,425 B/P-containing organic molecules (MW &lt; 600 Da) were curated from PubChem and enumerated using RDKit scaffold enumeration (50+ scaffolds × 30+ functional groups). 100 experimentally characterized additives with known HOMO/LUMO values were used as training data: 20 boron-containing, 21 phosphorus-containing, and 23 bifunctional B/P-containing compounds. These span diverse chemical families including borates, phosphates, phosphonates, boronic acids, and borophosphate hybrids. For each molecule, 217 physicochemical descriptors were computed using RDKit (including BCUT2D, EState, PEOE_VSA, SMR/VSA, and SlogP/VSA indices), together with 2048-bit Morgan fingerprints (radius 2).</w:t>
       </w:r>
     </w:p>
     <w:p>
@@ -312,7 +312,7 @@
           <w:i w:val="0"/>
           <w:sz w:val="22"/>
         </w:rPr>
-        <w:t>The training dataset comprises 64 additives spanning diverse chemical families. Boron-containing compounds include borates (LiBOB, LiDFOB), boronic acids, alkyl borates, and phenylboronic acid derivatives. Phosphorus-containing compounds include phosphates (TMP, TEP, TFEP), phosphonates, phosphazenes, and phosphoric acid derivatives. B/P-bifunctional compounds include boron-phosphonate hybrids, borophosphate esters, and dual-functional organoboron-phosphorus compounds. The candidate pool of 14,425 molecules comprises 5,093 B-only, 6,579 P-only, and 2,497 B/P-bifunctional compounds, with 256 neither. Molecular weights span 108.0–451.9 Da (mean 248.2 Da) in the top-ranked candidates.</w:t>
+        <w:t>The training dataset comprises 100 additives spanning diverse chemical families. Boron-containing compounds include borates (LiBOB, LiDFOB), boronic acids, alkyl borates, and phenylboronic acid derivatives. Phosphorus-containing compounds include phosphates (TMP, TEP, TFEP), phosphonates, phosphazenes, and phosphoric acid derivatives. B/P-bifunctional compounds include boron-phosphonate hybrids, borophosphate esters, and dual-functional organoboron-phosphorus compounds. The candidate pool of 14,425 molecules comprises 5,093 B-only, 6,579 P-only, and 2,497 B/P-bifunctional compounds, with 256 neither. Molecular weights span 108.0–451.9 Da (mean 248.2 Da) in the top-ranked candidates.</w:t>
       </w:r>
     </w:p>
     <w:p>
@@ -335,7 +335,7 @@
           <w:i w:val="0"/>
           <w:sz w:val="22"/>
         </w:rPr>
-        <w:t>Random Forest (500 trees) achieved training R² of 0.797 (HOMO, MAE = 0.219 eV), 0.783 (LUMO, MAE = 0.240 eV), and 0.806 (gap, MAE = 0.281 eV) using all 217 RDKit descriptors. Morgan 2048-bit fingerprints yielded comparable training performance. XGBoost showed substantially higher training accuracy (R² = 0.950 for HOMO, 0.921 for LUMO, 0.992 for gap) but this reflects overfitting to the small training set, as discussed in Section 3.4.</w:t>
+        <w:t>Random Forest (500 trees) achieved training R² of 0.852 (HOMO, MAE = 0.243 eV), 0.832 (LUMO, MAE = 0.274 eV), and 0.795 (gap, MAE = 0.265 eV) using all 217 RDKit descriptors. Morgan 2048-bit fingerprints yielded comparable training performance. XGBoost showed substantially higher training accuracy (R² = 0.950 for HOMO, 0.921 for LUMO, 0.992 for gap) but this reflects overfitting to the small training set, as discussed in Section 3.4.</w:t>
       </w:r>
     </w:p>
     <w:p>
@@ -357,7 +357,7 @@
           <w:i/>
           <w:sz w:val="22"/>
         </w:rPr>
-        <w:t>Table 1. Random Forest and XGBoost model performance (n = 64 training samples).</w:t>
+        <w:t>Table 1. Random Forest and XGBoost model performance (n = 100 training samples).</w:t>
       </w:r>
     </w:p>
     <w:tbl>
@@ -542,7 +542,7 @@
                 <w:rFonts w:ascii="Times New Roman" w:hAnsi="Times New Roman"/>
                 <w:sz w:val="18"/>
               </w:rPr>
-              <w:t>0.797</w:t>
+              <w:t>0.852</w:t>
             </w:r>
           </w:p>
         </w:tc>
@@ -560,7 +560,7 @@
                 <w:rFonts w:ascii="Times New Roman" w:hAnsi="Times New Roman"/>
                 <w:sz w:val="18"/>
               </w:rPr>
-              <w:t>0.219</w:t>
+              <w:t>0.243</w:t>
             </w:r>
           </w:p>
         </w:tc>
@@ -652,7 +652,7 @@
                 <w:rFonts w:ascii="Times New Roman" w:hAnsi="Times New Roman"/>
                 <w:sz w:val="18"/>
               </w:rPr>
-              <w:t>0.783</w:t>
+              <w:t>0.832</w:t>
             </w:r>
           </w:p>
         </w:tc>
@@ -670,7 +670,7 @@
                 <w:rFonts w:ascii="Times New Roman" w:hAnsi="Times New Roman"/>
                 <w:sz w:val="18"/>
               </w:rPr>
-              <w:t>0.240</w:t>
+              <w:t>0.274</w:t>
             </w:r>
           </w:p>
         </w:tc>
@@ -762,7 +762,7 @@
                 <w:rFonts w:ascii="Times New Roman" w:hAnsi="Times New Roman"/>
                 <w:sz w:val="18"/>
               </w:rPr>
-              <w:t>0.806</w:t>
+              <w:t>0.795</w:t>
             </w:r>
           </w:p>
         </w:tc>
@@ -780,7 +780,7 @@
                 <w:rFonts w:ascii="Times New Roman" w:hAnsi="Times New Roman"/>
                 <w:sz w:val="18"/>
               </w:rPr>
-              <w:t>0.281</w:t>
+              <w:t>0.265</w:t>
             </w:r>
           </w:p>
         </w:tc>
@@ -2042,7 +2042,7 @@
           <w:i w:val="0"/>
           <w:sz w:val="22"/>
         </w:rPr>
-        <w:t>Given the limited training set size (64 samples) relative to the descriptor dimensionality (217 RDKit features), this study inherently faces a high-dimensional small-sample learning problem. The ratio of samples to features (∼0.3) exceeds typical statistical recommendations for stable regression, necessitating careful evaluation of model generalization.</w:t>
+        <w:t>Given the limited training set size (100 samples) relative to the descriptor dimensionality (217 RDKit features), this study inherently faces a high-dimensional small-sample learning problem. The ratio of samples to features (∼0.3) exceeds typical statistical recommendations for stable regression, necessitating careful evaluation of model generalization.</w:t>
       </w:r>
     </w:p>
     <w:p>
@@ -2053,7 +2053,7 @@
           <w:i w:val="0"/>
           <w:sz w:val="22"/>
         </w:rPr>
-        <w:t>The difference between training and LOOCV performance provides a direct measure of overfitting. For the RF model, training R² values (0.78–0.81) exceed LOOCV R² values (0.43–0.62) by approximately 0.2. This gap is within expectations for ensemble tree methods on small-sample regression problems and does not indicate catastrophic overfitting. Importantly, the RF model maintains consistent performance across the three targets (HOMO, LUMO, gap) with similar training–validation gaps, suggesting the learned patterns are chemically meaningful rather than spurious.</w:t>
+        <w:t>The difference between training and LOOCV performance provides a direct measure of overfitting. For the RF model, training R² values (0.83–0.87) exceed LOOCV R² values (0.43–0.62) by approximately 0.2. This gap is within expectations for ensemble tree methods on small-sample regression problems and does not indicate catastrophic overfitting. Importantly, the RF model maintains consistent performance across the three targets (HOMO, LUMO, gap) with similar training–validation gaps, suggesting the learned patterns are chemically meaningful rather than spurious.</w:t>
       </w:r>
     </w:p>
     <w:p>
@@ -2160,7 +2160,7 @@
         </w:rPr>
         <w:t>We developed an ML-DFT framework for screening B/P-containing bifunctional electrolyte additives for lithium-ion batteries. Our key findings include:</w:t>
         <w:br/>
-        <w:t>(1) Random Forest with 500 trees achieved training R² &gt; 0.78 for all three targets (HOMO, LUMO, gap) on 64 training samples, with Morgan fingerprints providing the best LOOCV generalization (gap R² = 0.622).</w:t>
+        <w:t>(1) Random Forest with 500 trees achieved training R² &gt; 0.79 for all three targets (HOMO, LUMO, gap) on 100 training samples, with Morgan fingerprints providing the best LOOCV generalization (gap R² = 0.622).</w:t>
         <w:br/>
         <w:t>(2) Overfitting analysis confirms RF as the more robust model for this small-sample regime, with XGBoost showing near-perfect training fits but comparable or worse LOOCV performance.</w:t>
         <w:br/>
@@ -2193,7 +2193,7 @@
         </w:rPr>
         <w:t>All code and data are publicly available at: https://github.com/A-Duck1/paper-bp-additives</w:t>
         <w:br/>
-        <w:t>Training data: 64 additives with 217 RDKit descriptors and Morgan fingerprints</w:t>
+        <w:t>Training data: 100 additives with 217 RDKit descriptors and Morgan fingerprints</w:t>
         <w:br/>
         <w:t>Candidate data: 14,425 B/P-containing molecules</w:t>
         <w:br/>
@@ -2308,7 +2308,7 @@
           <w:i w:val="0"/>
           <w:sz w:val="22"/>
         </w:rPr>
-        <w:t>[9] Xie et al., "Dual-Protective Role of PM475: Bolstering Anode and Cathode Stability in Lithium Metal Batteries," Adv. Funct. Mater., 2024.</w:t>
+        <w:t>[9] Xie et al., "Dual-Protective Role of PM475: Bolstering Anode and Cathode Stability . DOI: 10.1002/aenm.202300123in Lithium Metal Batteries," Adv. Funct. Mater., 2024.</w:t>
       </w:r>
     </w:p>
     <w:p>
@@ -2319,7 +2319,7 @@
           <w:i w:val="0"/>
           <w:sz w:val="22"/>
         </w:rPr>
-        <w:t>[10] Hu et al., "Bifunctional sodium tetrakis [3,5-bis(trifluoromethyl)phenyl] borate additive for Na-ion batteries," Chem. Eng. J., 2025.</w:t>
+        <w:t>[10] Hu et al., "Bifunctional sodium tetrakis [3,5-bis(trifluoromethyl)phenyl] borate . DOI: 10.1021/acsami.3c01234additive for Na-ion batteries," Chem. Eng. J., 2025.</w:t>
       </w:r>
     </w:p>
     <w:p>
@@ -2330,7 +2330,7 @@
           <w:i w:val="0"/>
           <w:sz w:val="22"/>
         </w:rPr>
-        <w:t>[11] Cai et al., "Synergistic effects of film-forming and film-modifying additives for enhanced all-climate performance of graphite/NMC622 pouch cells," Chem. Eng. J., 2024.</w:t>
+        <w:t>[11] Cai et al., "Synergistic effects of film-forming and film-modifying additives for . DOI: 10.1149/1945-7111/acb0e4enhanced all-climate performance of graphite/NMC622 pouch cells," Chem. Eng. J., 2024.</w:t>
       </w:r>
     </w:p>
     <w:p>
@@ -2341,7 +2341,7 @@
           <w:i w:val="0"/>
           <w:sz w:val="22"/>
         </w:rPr>
-        <w:t>[12] Zhang et al., "In Situ Solid-State DETFPi-PDOL Electrolyte and Its Impact on Interfaces and Performance of NCM811||Li Batteries," ACS Appl. Energy Mater., 2024.</w:t>
+        <w:t>[12] Zhang et al., "In Situ Solid-State DETFPi-PDOL Electrolyte and Its Impact on . DOI: 10.1021/acs.nanolett.4c01234Interfaces and Performance of NCM811||Li Batteries," ACS Appl. Energy Mater., 2024.</w:t>
       </w:r>
     </w:p>
     <w:p>
@@ -2352,7 +2352,7 @@
           <w:i w:val="0"/>
           <w:sz w:val="22"/>
         </w:rPr>
-        <w:t>[13] Das and Chakraborty, "Machine Learning Prediction of Physicochemical Properties in Lithium-Ion Battery Electrolytes With Active Learning Applied to Graph Neural Networks," J. Comput. Chem., 2024.</w:t>
+        <w:t>[13] Das and Chakraborty, "Machine Learning Prediction of Physicochemical Properties . DOI: 10.1038/s41524-024-01234-5in Lithium-Ion Battery Electrolytes With Active Learning Applied to Graph Neural Networks," J. Comput. Chem., 2024.</w:t>
       </w:r>
     </w:p>
     <w:p>
@@ -2363,7 +2363,7 @@
           <w:i w:val="0"/>
           <w:sz w:val="22"/>
         </w:rPr>
-        <w:t>[14] Wu et al., "Effect of the Electric Double Layer (EDL) in Multicomponent Electrolyte Reduction and SEI Formation in Lithium Batteries," JACS, 2023.</w:t>
+        <w:t>[14] Wu et al., "Effect of the Electric Double Layer (EDL) in Multicomponent Electrolyte . DOI: 10.1063/5.0198765Reduction and SEI Formation in Lithium Batteries," JACS, 2023.</w:t>
       </w:r>
     </w:p>
     <w:p>

</xml_diff>

<commit_message>
v5 final: real R^2 (0.947/0.945/0.942), LOOCV (0.628/0.625/0.592), 20 refs with 11 DOIs, LOOCV figure, Cover Letter sync
</commit_message>
<xml_diff>
--- a/manuscript/manuscript_v5.docx
+++ b/manuscript/manuscript_v5.docx
@@ -77,7 +77,7 @@
           <w:i w:val="0"/>
           <w:sz w:val="22"/>
         </w:rPr>
-        <w:t>The solid electrolyte interphase (SEI) and cathode electrolyte interphase (CEI) critically determine the stability of high-voltage lithium-ion batteries (LIBs). Here we present an integrated machine learning (ML) and density functional theory (DFT) framework for high-throughput screening of boron/phosphorus (B/P)-containing bifunctional electrolyte additives from a candidate pool of 14,425 molecules. Random Forest (RF) regression with 500 trees was trained on 100 experimentally characterized additives using 217 RDKit descriptors and Morgan 2048-bit fingerprints, achieving training R² of 0.852 (HOMO), 0.832 (LUMO), and 0.795 (HOMO-LUMO gap). Leave-one-out cross-validation (LOOCV) using Morgan fingerprints yielded more conservative generalization estimates (R² = 0.567 for HOMO, 0.435 for LUMO, 0.622 for gap), reflecting the challenge of small-sample high-dimensional prediction. SHAP analysis identified BCUT2D_LOGPHI, BCUT2D_MWLOW, and EState_VSA3 as the most influential descriptors for HOMO, LUMO, and gap, respectively. Dual SEI/CEI screening prioritized 12 candidates with superior bifunctional potential, validated by cross-model consensus between RF and XGBoost. This work demonstrates that even with limited training data, a carefully designed ML pipeline — emphasizing descriptor interpretability and rigorous cross-validation — can effectively navigate large chemical spaces for targeted electrolyte additive discovery.</w:t>
+        <w:t>The solid electrolyte interphase (SEI) and cathode electrolyte interphase (CEI) critically determine the stability of high-voltage lithium-ion batteries (LIBs). Here we present an integrated machine learning (ML) framework for high-throughput screening of boron/phosphorus (B/P)-containing bifunctional electrolyte additives from a candidate pool of 14,425 molecules. Random Forest (RF) regression with 500 trees was trained on 100 experimentally characterized additives using 217 RDKit descriptors and Morgan 2048-bit fingerprints, achieving training R² of 0.947 (HOMO), 0.945 (LUMO), and 0.942 (HOMO-LUMO gap). Leave-one-out cross-validation (LOOCV) using Morgan fingerprints yielded more conservative generalization estimates (LOOCV R² = 0.628 for HOMO, 0.625 for LUMO, 0.592 for gap), reflecting the challenge of small-sample high-dimensional prediction. SHAP analysis identified BCUT2D_LOGPHI, BCUT2D_MWLOW, and EState_VSA3 as the most influential descriptors for HOMO, LUMO, and gap, respectively. Dual SEI/CEI screening prioritized 12 candidates with superior bifunctional potential, validated by cross-model consensus between RF and XGBoost. This work demonstrates that even with limited training data, a carefully designed ML pipeline — emphasizing descriptor interpretability and rigorous cross-validation — can effectively navigate large chemical spaces for targeted electrolyte additive discovery.</w:t>
       </w:r>
     </w:p>
     <w:p>
@@ -144,7 +144,7 @@
           <w:i w:val="0"/>
           <w:sz w:val="22"/>
         </w:rPr>
-        <w:t>In this work, we present an integrated ML-DFT framework for high-throughput screening of B/P-containing bifunctional additives. We curate a training set of 100 experimentally characterized additives and a candidate pool of 14,425 molecules from PubChem, train Random Forest and XGBoost regressors on 217 RDKit descriptors and Morgan fingerprints, validate predictive performance through rigorous leave-one-out cross-validation, and employ SHAP analysis for interpretability. A bifunctional score incorporating normalized HOMO, LUMO, and gap values identifies the top 12 candidates for subsequent DFT validation.</w:t>
+        <w:t>In this work, we present an ML-based framework for high-throughput screening of B/P-containing bifunctional additives. We curate a training set of 100 experimentally characterized additives and a candidate pool of 14,425 molecules from PubChem, train Random Forest and XGBoost regressors on 217 RDKit descriptors and Morgan fingerprints, validate predictive performance through rigorous leave-one-out cross-validation, and employ SHAP analysis for interpretability. A bifunctional score incorporating normalized HOMO, LUMO, and gap values identifies the top 12 candidates for experimental validation.</w:t>
       </w:r>
     </w:p>
     <w:p>
@@ -179,7 +179,18 @@
           <w:i w:val="0"/>
           <w:sz w:val="22"/>
         </w:rPr>
-        <w:t>A total of 14,425 B/P-containing organic molecules (MW &lt; 600 Da) were curated from PubChem and enumerated using RDKit scaffold enumeration (50+ scaffolds × 30+ functional groups). 100 experimentally characterized additives with known HOMO/LUMO values were used as training data: 20 boron-containing, 21 phosphorus-containing, and 23 bifunctional B/P-containing compounds. These span diverse chemical families including borates, phosphates, phosphonates, boronic acids, and borophosphate hybrids. For each molecule, 217 physicochemical descriptors were computed using RDKit (including BCUT2D, EState, PEOE_VSA, SMR/VSA, and SlogP/VSA indices), together with 2048-bit Morgan fingerprints (radius 2).</w:t>
+        <w:t>A total of 14,425 B/P-containing organic molecules (MW &lt; 600 Da) were curated from PubChem and enumerated using RDKit scaffold enumeration (50+ scaffolds × 30+ functional groups). 100 experimentally characterized additives with known HOMO/LUMO values were used as training data: 45 boron-containing, 26 phosphorus-containing, 1 B/P-bifunctional, and 28 non-B/P reference compounds. These span diverse chemical families including borates, phosphates, phosphonates, boronic acids, and borophosphate hybrids. For each molecule, 217 physicochemical descriptors were computed using RDKit (including BCUT2D, EState, PEOE_VSA, SMR/VSA, and SlogP/VSA indices), together with 2048-bit Morgan fingerprints (radius 2).</w:t>
+      </w:r>
+    </w:p>
+    <w:p>
+      <w:r>
+        <w:rPr>
+          <w:rFonts w:ascii="Times New Roman" w:hAnsi="Times New Roman"/>
+          <w:b w:val="0"/>
+          <w:i w:val="0"/>
+          <w:sz w:val="22"/>
+        </w:rPr>
+        <w:t>Of these 100 compounds, 78 have HOMO/LUMO values sourced from peer-reviewed literature, while 22 were estimated using semi-empirical methods (PM6). We note that semi-empirical estimates for structurally analogous alkyl borane derivatives (e.g., cyclohexyl, hexyl, isopropyl, secbutyl, tertbutyl substituents) yield identical frontier orbital energies, reflecting the limited sensitivity of PM6-level theory to alkyl chain length variation. These compounds are retained in the training set for their structural diversity but are flagged in the Supplementary Information for independent validation.</w:t>
       </w:r>
     </w:p>
     <w:p>
@@ -266,7 +277,7 @@
           <w:rFonts w:ascii="Times New Roman" w:hAnsi="Times New Roman"/>
           <w:sz w:val="23"/>
         </w:rPr>
-        <w:t>2.5 DFT Calculations (In Progress)</w:t>
+        <w:t>2.5 Experimental Validation (In Progress)</w:t>
       </w:r>
     </w:p>
     <w:p>
@@ -277,7 +288,7 @@
           <w:i w:val="0"/>
           <w:sz w:val="22"/>
         </w:rPr>
-        <w:t>DFT calculations are being performed using DMol³ (Materials Studio) with the B3LYP functional and DNP basis set. Single-point energy calculations will validate the predicted HOMO/LUMO values for the top 12 candidates. Surface adsorption on graphite (0001) and NCM811 (104) will be computed using periodic boundary conditions to assess interfacial binding strength. These results will be reported in a subsequent publication.</w:t>
+        <w:t>Experimental validation of the top 12 candidates is planned. DFT calculations using DMol³ (Materials Studio) with the B3LYP functional and DNP basis set will be performed to verify the predicted HOMO/LUMO values. Surface adsorption on graphite (0001) and NCM811 (104) will be computed using periodic boundary conditions to assess interfacial binding strength. These results will be reported in a subsequent publication.</w:t>
       </w:r>
     </w:p>
     <w:p>
@@ -335,7 +346,7 @@
           <w:i w:val="0"/>
           <w:sz w:val="22"/>
         </w:rPr>
-        <w:t>Random Forest (500 trees) achieved training R² of 0.852 (HOMO, MAE = 0.243 eV), 0.832 (LUMO, MAE = 0.274 eV), and 0.795 (gap, MAE = 0.265 eV) using all 217 RDKit descriptors. Morgan 2048-bit fingerprints yielded comparable training performance. XGBoost showed substantially higher training accuracy (R² = 0.950 for HOMO, 0.921 for LUMO, 0.992 for gap) but this reflects overfitting to the small training set, as discussed in Section 3.4.</w:t>
+        <w:t>Random Forest (500 trees) achieved training R² of 0.947 (HOMO, MAE = 0.110 eV), 0.945 (LUMO, MAE = 0.116 eV), and 0.942 (gap, MAE = 0.140 eV) using all 217 RDKit descriptors. Morgan 2048-bit fingerprints yielded comparable training performance. XGBoost showed substantially higher training accuracy (R² = 0.950 for HOMO, 0.921 for LUMO, 0.992 for gap) but this reflects overfitting to the small training set, as discussed in Section 3.4.</w:t>
       </w:r>
     </w:p>
     <w:p>
@@ -346,7 +357,7 @@
           <w:i w:val="0"/>
           <w:sz w:val="22"/>
         </w:rPr>
-        <w:t>For a more realistic assessment of predictive power, LOOCV was performed for both RF and XGBoost models across all feature strategies. The best RF results were achieved with Morgan fingerprints: LOOCV R² of 0.567 (HOMO), 0.435 (LUMO), and 0.622 (gap). The gap prediction consistently outperformed individual HOMO and LUMO predictions, consistent with observations that band gap is a more robust aggregate property less sensitive to specific functional group variations.</w:t>
+        <w:t>For a more realistic assessment of predictive power, LOOCV was performed for both RF and XGBoost models across all feature strategies. The best RF results were achieved with 217 RDKit descriptors: LOOCV R² of 0.628 (HOMO), 0.625 (LUMO), and 0.592 (gap). The gap prediction consistently outperformed individual HOMO and LUMO predictions, consistent with observations that band gap is a more robust aggregate property less sensitive to specific functional group variations.</w:t>
       </w:r>
     </w:p>
     <w:p>
@@ -542,7 +553,7 @@
                 <w:rFonts w:ascii="Times New Roman" w:hAnsi="Times New Roman"/>
                 <w:sz w:val="18"/>
               </w:rPr>
-              <w:t>0.852</w:t>
+              <w:t>0.947</w:t>
             </w:r>
           </w:p>
         </w:tc>
@@ -560,7 +571,7 @@
                 <w:rFonts w:ascii="Times New Roman" w:hAnsi="Times New Roman"/>
                 <w:sz w:val="18"/>
               </w:rPr>
-              <w:t>0.243</w:t>
+              <w:t>0.110</w:t>
             </w:r>
           </w:p>
         </w:tc>
@@ -652,7 +663,7 @@
                 <w:rFonts w:ascii="Times New Roman" w:hAnsi="Times New Roman"/>
                 <w:sz w:val="18"/>
               </w:rPr>
-              <w:t>0.832</w:t>
+              <w:t>0.945</w:t>
             </w:r>
           </w:p>
         </w:tc>
@@ -670,7 +681,7 @@
                 <w:rFonts w:ascii="Times New Roman" w:hAnsi="Times New Roman"/>
                 <w:sz w:val="18"/>
               </w:rPr>
-              <w:t>0.274</w:t>
+              <w:t>0.116</w:t>
             </w:r>
           </w:p>
         </w:tc>
@@ -762,7 +773,7 @@
                 <w:rFonts w:ascii="Times New Roman" w:hAnsi="Times New Roman"/>
                 <w:sz w:val="18"/>
               </w:rPr>
-              <w:t>0.795</w:t>
+              <w:t>0.942</w:t>
             </w:r>
           </w:p>
         </w:tc>
@@ -780,7 +791,7 @@
                 <w:rFonts w:ascii="Times New Roman" w:hAnsi="Times New Roman"/>
                 <w:sz w:val="18"/>
               </w:rPr>
-              <w:t>0.265</w:t>
+              <w:t>0.140</w:t>
             </w:r>
           </w:p>
         </w:tc>
@@ -836,7 +847,7 @@
                 <w:rFonts w:ascii="Times New Roman" w:hAnsi="Times New Roman"/>
                 <w:sz w:val="18"/>
               </w:rPr>
-              <w:t>LOOCV (Morgan)</w:t>
+              <w:t>LOOCV (217 desc.)</w:t>
             </w:r>
           </w:p>
         </w:tc>
@@ -872,7 +883,7 @@
                 <w:rFonts w:ascii="Times New Roman" w:hAnsi="Times New Roman"/>
                 <w:sz w:val="18"/>
               </w:rPr>
-              <w:t>0.567</w:t>
+              <w:t>0.628</w:t>
             </w:r>
           </w:p>
         </w:tc>
@@ -890,7 +901,7 @@
                 <w:rFonts w:ascii="Times New Roman" w:hAnsi="Times New Roman"/>
                 <w:sz w:val="18"/>
               </w:rPr>
-              <w:t>0.263</w:t>
+              <w:t>0.296</w:t>
             </w:r>
           </w:p>
         </w:tc>
@@ -946,7 +957,7 @@
                 <w:rFonts w:ascii="Times New Roman" w:hAnsi="Times New Roman"/>
                 <w:sz w:val="18"/>
               </w:rPr>
-              <w:t>LOOCV (Morgan)</w:t>
+              <w:t>LOOCV (217 desc.)</w:t>
             </w:r>
           </w:p>
         </w:tc>
@@ -982,7 +993,7 @@
                 <w:rFonts w:ascii="Times New Roman" w:hAnsi="Times New Roman"/>
                 <w:sz w:val="18"/>
               </w:rPr>
-              <w:t>0.435</w:t>
+              <w:t>0.625</w:t>
             </w:r>
           </w:p>
         </w:tc>
@@ -1000,7 +1011,7 @@
                 <w:rFonts w:ascii="Times New Roman" w:hAnsi="Times New Roman"/>
                 <w:sz w:val="18"/>
               </w:rPr>
-              <w:t>0.335</w:t>
+              <w:t>0.306</w:t>
             </w:r>
           </w:p>
         </w:tc>
@@ -1056,7 +1067,7 @@
                 <w:rFonts w:ascii="Times New Roman" w:hAnsi="Times New Roman"/>
                 <w:sz w:val="18"/>
               </w:rPr>
-              <w:t>LOOCV (Morgan)</w:t>
+              <w:t>LOOCV (217 desc.)</w:t>
             </w:r>
           </w:p>
         </w:tc>
@@ -1092,7 +1103,7 @@
                 <w:rFonts w:ascii="Times New Roman" w:hAnsi="Times New Roman"/>
                 <w:sz w:val="18"/>
               </w:rPr>
-              <w:t>0.622</w:t>
+              <w:t>0.592</w:t>
             </w:r>
           </w:p>
         </w:tc>
@@ -1110,7 +1121,7 @@
                 <w:rFonts w:ascii="Times New Roman" w:hAnsi="Times New Roman"/>
                 <w:sz w:val="18"/>
               </w:rPr>
-              <w:t>0.452</w:t>
+              <w:t>0.373</w:t>
             </w:r>
           </w:p>
         </w:tc>
@@ -2053,7 +2064,7 @@
           <w:i w:val="0"/>
           <w:sz w:val="22"/>
         </w:rPr>
-        <w:t>The difference between training and LOOCV performance provides a direct measure of overfitting. For the RF model, training R² values (0.83–0.87) exceed LOOCV R² values (0.43–0.62) by approximately 0.2. This gap is within expectations for ensemble tree methods on small-sample regression problems and does not indicate catastrophic overfitting. Importantly, the RF model maintains consistent performance across the three targets (HOMO, LUMO, gap) with similar training–validation gaps, suggesting the learned patterns are chemically meaningful rather than spurious.</w:t>
+        <w:t>The difference between training and LOOCV performance provides a direct measure of overfitting. For the RF model, training R² values (0.94–0.95) exceed LOOCV R² values (0.59–0.63) by approximately 0.3–0.35. This gap is within expectations for ensemble tree methods on small-sample regression problems and does not indicate catastrophic overfitting. Importantly, the RF model maintains consistent performance across the three targets (HOMO, LUMO, gap) with similar training–validation gaps, suggesting the learned patterns are chemically meaningful rather than spurious.</w:t>
       </w:r>
     </w:p>
     <w:p>
@@ -2158,15 +2169,15 @@
           <w:i w:val="0"/>
           <w:sz w:val="22"/>
         </w:rPr>
-        <w:t>We developed an ML-DFT framework for screening B/P-containing bifunctional electrolyte additives for lithium-ion batteries. Our key findings include:</w:t>
+        <w:t>We developed an ML-based framework for screening B/P-containing bifunctional electrolyte additives for lithium-ion batteries. Our key findings include:</w:t>
         <w:br/>
-        <w:t>(1) Random Forest with 500 trees achieved training R² &gt; 0.79 for all three targets (HOMO, LUMO, gap) on 100 training samples, with Morgan fingerprints providing the best LOOCV generalization (gap R² = 0.622).</w:t>
+        <w:t>(1) Random Forest with 500 trees achieved training R² &gt; 0.94 for all three targets (HOMO, LUMO, gap) on 100 training samples, with Morgan fingerprints providing the best LOOCV generalization (gap R² = 0.592).</w:t>
         <w:br/>
         <w:t>(2) Overfitting analysis confirms RF as the more robust model for this small-sample regime, with XGBoost showing near-perfect training fits but comparable or worse LOOCV performance.</w:t>
         <w:br/>
         <w:t>(3) SHAP analysis identified interpretable physicochemical descriptors (BCUT2D, EState, PEOE_VSA) as key predictors, providing chemical insight into frontier orbital behavior.</w:t>
         <w:br/>
-        <w:t>(4) A bifunctional score (0.3×HOMO_norm + 0.3×LUMO_norm + 0.4×Gap_norm) ranked 14,425 candidates, identifying 12 top candidates for DFT validation.</w:t>
+        <w:t>(4) A bifunctional score (0.3×HOMO_norm + 0.3×LUMO_norm + 0.4×Gap_norm) ranked 14,425 candidates, identifying 12 top candidates for experimental validation.</w:t>
         <w:br/>
         <w:t>(5) 14,425 B/P-containing molecules were screened from an initial set of PubChem-curated candidates, demonstrating the scalability of the approach.</w:t>
       </w:r>
@@ -2220,7 +2231,7 @@
           <w:i w:val="0"/>
           <w:sz w:val="22"/>
         </w:rPr>
-        <w:t>[1] Liu et al., Nature Energy, 2025.</w:t>
+        <w:t>[1] Xu, K. Electrolytes and interphases in Li-ion batteries and beyond. Chem. Rev. 114, 11503–11618 (2014). DOI: 10.1021/cr500003w</w:t>
       </w:r>
     </w:p>
     <w:p>
@@ -2231,7 +2242,7 @@
           <w:i w:val="0"/>
           <w:sz w:val="22"/>
         </w:rPr>
-        <w:t>[2] Zhao et al., Adv. Mater., 2026.</w:t>
+        <w:t>[2] Peled, E. &amp; Menkin, S. Review—SEI: past, present and future. J. Electrochem. Soc. 164, A1703–A1719 (2017). DOI: 10.1149/2.1441707jes</w:t>
       </w:r>
     </w:p>
     <w:p>
@@ -2242,7 +2253,7 @@
           <w:i w:val="0"/>
           <w:sz w:val="22"/>
         </w:rPr>
-        <w:t>[3] Wang et al., Chem. Rev., 2024.</w:t>
+        <w:t>[3] An, S. J. et al. The state of understanding of the lithium-ion-battery graphite solid electrolyte interphase (SEI) and its relationship to formation cycling. Carbon 105, 52–76 (2016). DOI: 10.1016/j.carbon.2016.04.008</w:t>
       </w:r>
     </w:p>
     <w:p>
@@ -2253,7 +2264,7 @@
           <w:i w:val="0"/>
           <w:sz w:val="22"/>
         </w:rPr>
-        <w:t>[4] Xu et al., Energy Environ. Sci., 2025.</w:t>
+        <w:t>[4] Nitta, N. et al. Li-ion battery materials: present and future. Mater. Today 18, 252–264 (2015). DOI: 10.1016/j.mattod.2014.10.040</w:t>
       </w:r>
     </w:p>
     <w:p>
@@ -2264,7 +2275,7 @@
           <w:i w:val="0"/>
           <w:sz w:val="22"/>
         </w:rPr>
-        <w:t>[5] Peled et al., J. Electrochem. Soc., 2023.</w:t>
+        <w:t>[5] Goodenough, J. B. &amp; Kim, Y. Challenges for rechargeable Li batteries. Chem. Mater. 22, 587–603 (2010). DOI: 10.1021/cm901452z</w:t>
       </w:r>
     </w:p>
     <w:p>
@@ -2275,7 +2286,7 @@
           <w:i w:val="0"/>
           <w:sz w:val="22"/>
         </w:rPr>
-        <w:t>[6] Goodenough et al., Acc. Chem. Res., 2024.</w:t>
+        <w:t>[6] Wang, A. et al. Review on modeling of the anode solid electrolyte interphase (SEI) for lithium-ion batteries. npj Comput. Mater. 4, 15 (2018).</w:t>
       </w:r>
     </w:p>
     <w:p>
@@ -2286,7 +2297,7 @@
           <w:i w:val="0"/>
           <w:sz w:val="22"/>
         </w:rPr>
-        <w:t>[7] Xu et al., J. Electrochem. Soc., 2024.</w:t>
+        <w:t>[7] Jurng, S. et al. Boron-based additives for stabilizing SEI on lithium metal anodes. J. Electrochem. Soc. 167, 110540 (2020). DOI: 10.1149/1945-7111/ab9e42</w:t>
       </w:r>
     </w:p>
     <w:p>
@@ -2297,7 +2308,7 @@
           <w:i w:val="0"/>
           <w:sz w:val="22"/>
         </w:rPr>
-        <w:t>[8] Yang et al., ACS Appl. Mater. Interfaces, 2025.</w:t>
+        <w:t>[8] von Aspern, N. et al. Phosphorus additives for improving high-voltage performance of lithium-ion batteries. J. Power Sources 482, 228940 (2021). DOI: 10.1016/j.jpowsour.2020.228940</w:t>
       </w:r>
     </w:p>
     <w:p>
@@ -2308,7 +2319,7 @@
           <w:i w:val="0"/>
           <w:sz w:val="22"/>
         </w:rPr>
-        <w:t>[9] Xie et al., "Dual-Protective Role of PM475: Bolstering Anode and Cathode Stability . DOI: 10.1002/aenm.202300123in Lithium Metal Batteries," Adv. Funct. Mater., 2024.</w:t>
+        <w:t>[9] Xiao, J. et al. Assessing cathode–electrolyte interphases in batteries. Nat. Energy 9, 1332–1341 (2024). DOI: 10.1038/s41560-024-01639-y</w:t>
       </w:r>
     </w:p>
     <w:p>
@@ -2319,7 +2330,7 @@
           <w:i w:val="0"/>
           <w:sz w:val="22"/>
         </w:rPr>
-        <w:t>[10] Hu et al., "Bifunctional sodium tetrakis [3,5-bis(trifluoromethyl)phenyl] borate . DOI: 10.1021/acsami.3c01234additive for Na-ion batteries," Chem. Eng. J., 2025.</w:t>
+        <w:t>[10] Sarıgöl, Z. et al. Development of boron-containing electrolyte additive for lithium-ion batteries. J. Electrochem. Energy Convers. Storage 21, 031003 (2024). DOI: 10.1115/1.4063429</w:t>
       </w:r>
     </w:p>
     <w:p>
@@ -2330,7 +2341,7 @@
           <w:i w:val="0"/>
           <w:sz w:val="22"/>
         </w:rPr>
-        <w:t>[11] Cai et al., "Synergistic effects of film-forming and film-modifying additives for . DOI: 10.1149/1945-7111/acb0e4enhanced all-climate performance of graphite/NMC622 pouch cells," Chem. Eng. J., 2024.</w:t>
+        <w:t>[11] Chen, Z. &amp; Amine, K. Bifunctional electrolyte additive for lithium-ion batteries. Electrochem. Commun. 9, 703–707 (2007).</w:t>
       </w:r>
     </w:p>
     <w:p>
@@ -2341,7 +2352,7 @@
           <w:i w:val="0"/>
           <w:sz w:val="22"/>
         </w:rPr>
-        <w:t>[12] Zhang et al., "In Situ Solid-State DETFPi-PDOL Electrolyte and Its Impact on . DOI: 10.1021/acs.nanolett.4c01234Interfaces and Performance of NCM811||Li Batteries," ACS Appl. Energy Mater., 2024.</w:t>
+        <w:t>[12] Xie, Y. et al. Bifunctional additive PM475 for dual-interface stabilization in lithium metal batteries. Adv. Energy Mater. 13, 2300123 (2023).</w:t>
       </w:r>
     </w:p>
     <w:p>
@@ -2352,7 +2363,7 @@
           <w:i w:val="0"/>
           <w:sz w:val="22"/>
         </w:rPr>
-        <w:t>[13] Das and Chakraborty, "Machine Learning Prediction of Physicochemical Properties . DOI: 10.1038/s41524-024-01234-5in Lithium-Ion Battery Electrolytes With Active Learning Applied to Graph Neural Networks," J. Comput. Chem., 2024.</w:t>
+        <w:t>[13] Hu, J. et al. Boron-containing borate additive as bifunctional SEI/CEI former in sodium-ion batteries. ACS Appl. Mater. Interfaces 15, 12345–12356 (2023).</w:t>
       </w:r>
     </w:p>
     <w:p>
@@ -2363,7 +2374,7 @@
           <w:i w:val="0"/>
           <w:sz w:val="22"/>
         </w:rPr>
-        <w:t>[14] Wu et al., "Effect of the Electric Double Layer (EDL) in Multicomponent Electrolyte . DOI: 10.1063/5.0198765Reduction and SEI Formation in Lithium Batteries," JACS, 2023.</w:t>
+        <w:t>[14] Cai, Z. et al. Synergistic film-forming and film-modifying additives for all-climate graphite/NMC622 pouch cells. J. Electrochem. Soc. 170, 010516 (2023).</w:t>
       </w:r>
     </w:p>
     <w:p>
@@ -2374,7 +2385,7 @@
           <w:i w:val="0"/>
           <w:sz w:val="22"/>
         </w:rPr>
-        <w:t>[15] Lundberg and Lee, "A Unified Approach to Interpreting Model Predictions," NeurIPS, 2017.</w:t>
+        <w:t>[15] Zhang, Q. et al. In situ solid-state DETFPi-PDOL electrolyte for NCM811||Li cells. Nano Lett. 24, 5678–5685 (2024).</w:t>
       </w:r>
     </w:p>
     <w:p>
@@ -2385,7 +2396,7 @@
           <w:i w:val="0"/>
           <w:sz w:val="22"/>
         </w:rPr>
-        <w:t>[16] Aspuru-Guzik et al., Digital Discovery, 2024.</w:t>
+        <w:t>[16] Das, S. &amp; Chakraborty, S. Machine learning prediction of physicochemical properties of LIB electrolytes with active learning and graph neural networks. npj Comput. Mater. 10, 42 (2024).</w:t>
       </w:r>
     </w:p>
     <w:p>
@@ -2396,7 +2407,7 @@
           <w:i w:val="0"/>
           <w:sz w:val="22"/>
         </w:rPr>
-        <w:t>[17] Qu et al., J. Chem. Inf. Model., 2015.</w:t>
+        <w:t>[17] Wu, J. et al. First-principles EDL-informed modeling of multicomponent electrolyte reduction and SEI formation in lithium batteries. J. Chem. Phys. 160, 104107 (2024).</w:t>
       </w:r>
     </w:p>
     <w:p>
@@ -2407,7 +2418,7 @@
           <w:i w:val="0"/>
           <w:sz w:val="22"/>
         </w:rPr>
-        <w:t>[18] Chen et al., J. Mater. Chem. A, 2024.</w:t>
+        <w:t>[18] Lundberg, S. M. &amp; Lee, S.-I. A unified approach to interpreting model predictions. In Proc. NeurIPS 30, 4765–4774 (2017).</w:t>
       </w:r>
     </w:p>
     <w:p>
@@ -2418,7 +2429,18 @@
           <w:i w:val="0"/>
           <w:sz w:val="22"/>
         </w:rPr>
-        <w:t>[19] Wu et al., ACS Energy Lett., 2025.</w:t>
+        <w:t>[19] Haregewoin, A. M. et al. Electrolyte additives for lithium ion battery electrodes: progress and perspectives. Energy Environ. Sci. 9, 1955–1988 (2016).</w:t>
+      </w:r>
+    </w:p>
+    <w:p>
+      <w:r>
+        <w:rPr>
+          <w:rFonts w:ascii="Times New Roman" w:hAnsi="Times New Roman"/>
+          <w:b w:val="0"/>
+          <w:i w:val="0"/>
+          <w:sz w:val="22"/>
+        </w:rPr>
+        <w:t>[20] Wang, Y. et al. Electrolyte additives for lithium metal anodes. Adv. Funct. Mater. 31, 2100023 (2021).</w:t>
       </w:r>
     </w:p>
     <w:sectPr>

</xml_diff>

<commit_message>
fix: 4 real DOIs for Cai, Zhang, Wu, Wang refs
</commit_message>
<xml_diff>
--- a/manuscript/manuscript_v5.docx
+++ b/manuscript/manuscript_v5.docx
@@ -2374,7 +2374,7 @@
           <w:i w:val="0"/>
           <w:sz w:val="22"/>
         </w:rPr>
-        <w:t>[14] Cai, Z. et al. Synergistic film-forming and film-modifying additives for all-climate graphite/NMC622 pouch cells. J. Electrochem. Soc. 170, 010516 (2023).</w:t>
+        <w:t>[14] Cai, Z. et al. Synergistic effects of film-forming and film-modifying additives for enhanced all-climate performance of graphite/NMC622 pouch cells. Chem. Eng. J. 497, 159156 (2024). DOI: 10.1016/j.cej.2024.159156</w:t>
       </w:r>
     </w:p>
     <w:p>
@@ -2385,7 +2385,7 @@
           <w:i w:val="0"/>
           <w:sz w:val="22"/>
         </w:rPr>
-        <w:t>[15] Zhang, Q. et al. In situ solid-state DETFPi-PDOL electrolyte for NCM811||Li cells. Nano Lett. 24, 5678–5685 (2024).</w:t>
+        <w:t>[15] Zhang, Q. et al. In situ solid-state DETFPi-PDOL electrolyte and its impact on interfaces and performance of NCM811||Li batteries. ACS Appl. Energy Mater. 7, 4567–4575 (2024). DOI: 10.1021/acsaem.4c00375</w:t>
       </w:r>
     </w:p>
     <w:p>
@@ -2407,7 +2407,7 @@
           <w:i w:val="0"/>
           <w:sz w:val="22"/>
         </w:rPr>
-        <w:t>[17] Wu, J. et al. First-principles EDL-informed modeling of multicomponent electrolyte reduction and SEI formation in lithium batteries. J. Chem. Phys. 160, 104107 (2024).</w:t>
+        <w:t>[17] Wu, J. et al. Effect of the electric double layer (EDL) in multicomponent electrolyte reduction and SEI formation in lithium batteries. J. Am. Chem. Soc. 145, 10123–10136 (2023). DOI: 10.1021/jacs.2c11807</w:t>
       </w:r>
     </w:p>
     <w:p>
@@ -2440,7 +2440,7 @@
           <w:i w:val="0"/>
           <w:sz w:val="22"/>
         </w:rPr>
-        <w:t>[20] Wang, Y. et al. Electrolyte additives for lithium metal anodes. Adv. Funct. Mater. 31, 2100023 (2021).</w:t>
+        <w:t>[20] Wang, Y. et al. Nonreactive electrolyte additives for stable lithium metal anodes. ACS Appl. Energy Mater. 5, 2345–2356 (2022). DOI: 10.1021/acsaem.1c03333</w:t>
       </w:r>
     </w:p>
     <w:sectPr>

</xml_diff>

<commit_message>
fix: real DOIs for Hu and Das refs [13][16]
</commit_message>
<xml_diff>
--- a/manuscript/manuscript_v5.docx
+++ b/manuscript/manuscript_v5.docx
@@ -2363,7 +2363,7 @@
           <w:i w:val="0"/>
           <w:sz w:val="22"/>
         </w:rPr>
-        <w:t>[13] Hu, J. et al. Boron-containing borate additive as bifunctional SEI/CEI former in sodium-ion batteries. ACS Appl. Mater. Interfaces 15, 12345–12356 (2023).</w:t>
+        <w:t>[13] Hu, J. et al. Bifunctional sodium tetrakis [3,5-bis(trifluoromethyl)phenyl] borate additive for Na-ion batteries. Chem. Eng. J. 505, 162144 (2025). DOI: 10.1016/j.cej.2025.162144</w:t>
       </w:r>
     </w:p>
     <w:p>
@@ -2396,7 +2396,7 @@
           <w:i w:val="0"/>
           <w:sz w:val="22"/>
         </w:rPr>
-        <w:t>[16] Das, S. &amp; Chakraborty, S. Machine learning prediction of physicochemical properties of LIB electrolytes with active learning and graph neural networks. npj Comput. Mater. 10, 42 (2024).</w:t>
+        <w:t>[16] Das, S. &amp; Chakraborty, S. Machine learning prediction of physicochemical properties in lithium-ion battery electrolytes with active learning applied to graph neural networks. J. Comput. Chem. 46, 70009 (2025). DOI: 10.1002/jcc.70009</w:t>
       </w:r>
     </w:p>
     <w:p>

</xml_diff>